<commit_message>
Auto commit: 2026-07-31 09:48:44
</commit_message>
<xml_diff>
--- a/projects/14_my_daughters_husband/Vigloo AI Drama Proposal_MY DAUGHTER'S MAN.docx
+++ b/projects/14_my_daughters_husband/Vigloo AI Drama Proposal_MY DAUGHTER'S MAN.docx
@@ -2320,7 +2320,7 @@
                 <w:rFonts w:ascii="Malgun Gothic" w:hAnsi="Malgun Gothic" w:eastAsia="Malgun Gothic"/>
                 <w:sz w:val="20"/>
               </w:rPr>
-              <w:t>유료 42화는 날짜가 42번 바뀌는 이야기가 아니라 네 덩어리로 되어 있다 — 세 사람이 처음 한집에 사는 첫 주(9~20), 딸이 사흘 집을 비운 동안(21~31), 그녀가 계단에서 발목을 접질려 나흘을 못 걷는 동안(32~42), 그리고 딸의 발령과 출국(43~50). 각 덩어리 안에서 방해가 계속 끼어들고, 끼어들 때마다 수위가 한 칸씩 올라간다.</w:t>
+              <w:t>유료 42화는 날짜가 42번 바뀌는 이야기가 아니다. 한 방에서 이어지는 덩어리 다섯 개와, 그 사이를 한 회로 넘기는 다리 네 개로 되어 있다 — 이든이 이사 온 첫날 밤의 드레스룸(9~14), 딸이 사흘 집을 비운 동안 그녀가 나오지 않는 침실(16~22), 발목을 접질려 이 층을 못 올라가 아래층 서재에 갇힌 나흘(24~36), 딸의 해외 발령을 들은 그날 밤의 침실(38~43), 그리고 딸이 떠나기 전날 밤의 드레스룸(45~50). 덩어리 길이는 그 방이 버텨 주는 만큼이다 — 못 걷는 나흘이 제일 길고, 나갈 수 있는 방은 짧다. 방은 세 곳뿐이고 두 곳은 두 번씩 쓴다. 덩어리 하나 안에서는 카메라가 그 방을 안 떠난다. 방해는 방을 옮겨서 오는 게 아니라 밖에서 들어온다 — 아래층에서 딸이 엄마를 부르고, 계단에서 가사도우미 발소리가 올라오고, 문 앞에서 청소기 소리가 왔다 멀어진다. 끼어들 때마다 수위가 한 칸씩 올라간다.</w:t>
             </w:r>
           </w:p>
           <w:p>
@@ -2496,7 +2496,7 @@
                 <w:rFonts w:ascii="Malgun Gothic" w:hAnsi="Malgun Gothic" w:eastAsia="Malgun Gothic"/>
                 <w:sz w:val="20"/>
               </w:rPr>
-              <w:t>6. 슬론은 끝내 알아내지 못한 채 떠난다. 떠나는 날 남기는 말은 1화와 똑같은 "엄마 잘 부탁해." 그리고 빈 저택에서 그날 밤이 되풀이된다.</w:t>
+              <w:t>6. 슬론은 끝내 알아내지 못한 채 떠난다. 떠나는 날 아침 현관에서 엄마를 안고, 남자친구에게 엄마를 부탁하고 간다. 그리고 빈 저택에서 그날 밤이 되풀이된다.</w:t>
             </w:r>
           </w:p>
         </w:tc>
@@ -2775,6 +2775,1381 @@
               <w:ind w:left="0"/>
               <w:jc w:val="left"/>
             </w:pPr>
+            <w:r>
+              <w:rPr>
+                <w:rFonts w:ascii="Malgun Gothic" w:hAnsi="Malgun Gothic" w:eastAsia="Malgun Gothic"/>
+                <w:sz w:val="20"/>
+              </w:rPr>
+              <w:t>1화</w:t>
+            </w:r>
+          </w:p>
+          <w:p>
+            <w:r>
+              <w:rPr>
+                <w:rFonts w:ascii="Malgun Gothic" w:hAnsi="Malgun Gothic" w:eastAsia="Malgun Gothic"/>
+                <w:sz w:val="20"/>
+              </w:rPr>
+              <w:t>(밤. 호텔 객실. 문이 닫히자마자 벽에 붙는 두 사람. 검은 원피스 지퍼가 등에서 내려가는 중이고, 그녀의 손은 그의 셔츠 단추를 뜯듯이 풀고 있다.)</w:t>
+            </w:r>
+          </w:p>
+          <w:p>
+            <w:r>
+              <w:rPr>
+                <w:rFonts w:ascii="Malgun Gothic" w:hAnsi="Malgun Gothic" w:eastAsia="Malgun Gothic"/>
+                <w:sz w:val="20"/>
+              </w:rPr>
+              <w:t>VO — 스물여덟짜리 손이 내 원피스 지퍼를 등뼈 하나씩 타고 내려갔다. 남편 일 주기 날 밤이었다.</w:t>
+            </w:r>
+          </w:p>
+          <w:p>
+            <w:r>
+              <w:rPr>
+                <w:rFonts w:ascii="Malgun Gothic" w:hAnsi="Malgun Gothic" w:eastAsia="Malgun Gothic"/>
+                <w:sz w:val="20"/>
+              </w:rPr>
+              <w:t>VO — 조문객들 밥 먹여 보내고, 딸 돌려보내고, 반지 낀 손으로 차 키를 들고 나온 지 한 시간 만이었다.</w:t>
+            </w:r>
+          </w:p>
+          <w:p>
+            <w:r>
+              <w:rPr>
+                <w:rFonts w:ascii="Malgun Gothic" w:hAnsi="Malgun Gothic" w:eastAsia="Malgun Gothic"/>
+                <w:sz w:val="20"/>
+              </w:rPr>
+              <w:t>VO — 호텔 바에서 두 잔. 옆자리 남자가 내가 마시던 걸로 시켰고, 나는 그 잔이 나오는 걸 끝까지 봤다.</w:t>
+            </w:r>
+          </w:p>
+          <w:p>
+            <w:r>
+              <w:rPr>
+                <w:rFonts w:ascii="Malgun Gothic" w:hAnsi="Malgun Gothic" w:eastAsia="Malgun Gothic"/>
+                <w:sz w:val="20"/>
+              </w:rPr>
+              <w:t>(어깨끈이 내려간다. 그의 입술이 목으로 내려가고 그녀가 고개를 젖힌다.)</w:t>
+            </w:r>
+          </w:p>
+          <w:p>
+            <w:r>
+              <w:rPr>
+                <w:rFonts w:ascii="Malgun Gothic" w:hAnsi="Malgun Gothic" w:eastAsia="Malgun Gothic"/>
+                <w:sz w:val="20"/>
+              </w:rPr>
+              <w:t>VO — 남편이 죽고 일 년이었다. 그 전에 안 한 지는 훨씬 오래됐고.</w:t>
+            </w:r>
+          </w:p>
+          <w:p>
+            <w:r>
+              <w:rPr>
+                <w:rFonts w:ascii="Malgun Gothic" w:hAnsi="Malgun Gothic" w:eastAsia="Malgun Gothic"/>
+                <w:sz w:val="20"/>
+              </w:rPr>
+              <w:t>VO — 그동안 나는 내가 그런 걸 안 원하는 사람인 줄 알았다.</w:t>
+            </w:r>
+          </w:p>
+          <w:p>
+            <w:r>
+              <w:rPr>
+                <w:rFonts w:ascii="Malgun Gothic" w:hAnsi="Malgun Gothic" w:eastAsia="Malgun Gothic"/>
+                <w:sz w:val="20"/>
+              </w:rPr>
+              <w:t>VO — 아니었다.</w:t>
+            </w:r>
+          </w:p>
+          <w:p>
+            <w:r>
+              <w:rPr>
+                <w:rFonts w:ascii="Malgun Gothic" w:hAnsi="Malgun Gothic" w:eastAsia="Malgun Gothic"/>
+                <w:sz w:val="20"/>
+              </w:rPr>
+              <w:t>VO — 목에 입술이 닿았을 때 다리가 먼저 풀렸다.</w:t>
+            </w:r>
+          </w:p>
+          <w:p>
+            <w:r>
+              <w:rPr>
+                <w:rFonts w:ascii="Malgun Gothic" w:hAnsi="Malgun Gothic" w:eastAsia="Malgun Gothic"/>
+                <w:sz w:val="20"/>
+              </w:rPr>
+              <w:t>(그가 잠깐 떨어져 숨을 고른다. 이마가 닿을 거리.)</w:t>
+            </w:r>
+          </w:p>
+          <w:p>
+            <w:r>
+              <w:rPr>
+                <w:rFonts w:ascii="Malgun Gothic" w:hAnsi="Malgun Gothic" w:eastAsia="Malgun Gothic"/>
+                <w:sz w:val="20"/>
+              </w:rPr>
+              <w:t>이든 — "이든이에요. 스물여덟."</w:t>
+            </w:r>
+          </w:p>
+          <w:p>
+            <w:r>
+              <w:rPr>
+                <w:rFonts w:ascii="Malgun Gothic" w:hAnsi="Malgun Gothic" w:eastAsia="Malgun Gothic"/>
+                <w:sz w:val="20"/>
+              </w:rPr>
+              <w:t>이든 — "그쪽은요?"</w:t>
+            </w:r>
+          </w:p>
+          <w:p>
+            <w:r>
+              <w:rPr>
+                <w:rFonts w:ascii="Malgun Gothic" w:hAnsi="Malgun Gothic" w:eastAsia="Malgun Gothic"/>
+                <w:sz w:val="20"/>
+              </w:rPr>
+              <w:t>빅토리아 — "빅…"</w:t>
+            </w:r>
+          </w:p>
+          <w:p>
+            <w:r>
+              <w:rPr>
+                <w:rFonts w:ascii="Malgun Gothic" w:hAnsi="Malgun Gothic" w:eastAsia="Malgun Gothic"/>
+                <w:sz w:val="20"/>
+              </w:rPr>
+              <w:t>빅토리아 — "…비비안이에요."</w:t>
+            </w:r>
+          </w:p>
+          <w:p>
+            <w:r>
+              <w:rPr>
+                <w:rFonts w:ascii="Malgun Gothic" w:hAnsi="Malgun Gothic" w:eastAsia="Malgun Gothic"/>
+                <w:sz w:val="20"/>
+              </w:rPr>
+              <w:t>VO — 못 들은 척해 준 건지 진짜 못 들은 건지, 나는 지금도 모른다.</w:t>
+            </w:r>
+          </w:p>
+          <w:p>
+            <w:r>
+              <w:rPr>
+                <w:rFonts w:ascii="Malgun Gothic" w:hAnsi="Malgun Gothic" w:eastAsia="Malgun Gothic"/>
+                <w:sz w:val="20"/>
+              </w:rPr>
+              <w:t>이든 — "몇이신데요."</w:t>
+            </w:r>
+          </w:p>
+          <w:p>
+            <w:r>
+              <w:rPr>
+                <w:rFonts w:ascii="Malgun Gothic" w:hAnsi="Malgun Gothic" w:eastAsia="Malgun Gothic"/>
+                <w:sz w:val="20"/>
+              </w:rPr>
+              <w:t>빅토리아 — "…마흔."</w:t>
+            </w:r>
+          </w:p>
+          <w:p>
+            <w:r>
+              <w:rPr>
+                <w:rFonts w:ascii="Malgun Gothic" w:hAnsi="Malgun Gothic" w:eastAsia="Malgun Gothic"/>
+                <w:sz w:val="20"/>
+              </w:rPr>
+              <w:t>VO — 마흔셋이었다.</w:t>
+            </w:r>
+          </w:p>
+          <w:p>
+            <w:r>
+              <w:rPr>
+                <w:rFonts w:ascii="Malgun Gothic" w:hAnsi="Malgun Gothic" w:eastAsia="Malgun Gothic"/>
+                <w:sz w:val="20"/>
+              </w:rPr>
+              <w:t>VO — 이름은 통째로 가짜로 주면서 나이는 세 살이 아까웠다.</w:t>
+            </w:r>
+          </w:p>
+          <w:p>
+            <w:r>
+              <w:rPr>
+                <w:rFonts w:ascii="Malgun Gothic" w:hAnsi="Malgun Gothic" w:eastAsia="Malgun Gothic"/>
+                <w:sz w:val="20"/>
+              </w:rPr>
+              <w:t>VO — 이름은 안 알려 줬다. 몸은 다 벗어 놓고.</w:t>
+            </w:r>
+          </w:p>
+          <w:p>
+            <w:r>
+              <w:rPr>
+                <w:rFonts w:ascii="Malgun Gothic" w:hAnsi="Malgun Gothic" w:eastAsia="Malgun Gothic"/>
+                <w:sz w:val="20"/>
+              </w:rPr>
+              <w:t>VO — 그게 더 나쁜 짓 같았다.</w:t>
+            </w:r>
+          </w:p>
+          <w:p>
+            <w:r>
+              <w:rPr>
+                <w:rFonts w:ascii="Malgun Gothic" w:hAnsi="Malgun Gothic" w:eastAsia="Malgun Gothic"/>
+                <w:sz w:val="20"/>
+              </w:rPr>
+              <w:t>(다시 붙는다. 원피스가 발치로 떨어진다. 그가 그녀를 안아 올린다.)</w:t>
+            </w:r>
+          </w:p>
+          <w:p>
+            <w:r>
+              <w:rPr>
+                <w:rFonts w:ascii="Malgun Gothic" w:hAnsi="Malgun Gothic" w:eastAsia="Malgun Gothic"/>
+                <w:sz w:val="20"/>
+              </w:rPr>
+              <w:t>VO — 오늘 하루만. 이름도 안 준 남자랑, 오늘 하루만.</w:t>
+            </w:r>
+          </w:p>
+          <w:p>
+            <w:r>
+              <w:rPr>
+                <w:rFonts w:ascii="Malgun Gothic" w:hAnsi="Malgun Gothic" w:eastAsia="Malgun Gothic"/>
+                <w:sz w:val="20"/>
+              </w:rPr>
+              <w:t>VO — 아침까지만 버티면 된다고 생각했다.</w:t>
+            </w:r>
+          </w:p>
+          <w:p>
+            <w:r>
+              <w:rPr>
+                <w:rFonts w:ascii="Malgun Gothic" w:hAnsi="Malgun Gothic" w:eastAsia="Malgun Gothic"/>
+                <w:sz w:val="20"/>
+              </w:rPr>
+              <w:t>(침대로 쓰러지는 두 사람.)</w:t>
+            </w:r>
+          </w:p>
+          <w:p>
+            <w:r>
+              <w:rPr>
+                <w:rFonts w:ascii="Malgun Gothic" w:hAnsi="Malgun Gothic" w:eastAsia="Malgun Gothic"/>
+                <w:sz w:val="20"/>
+              </w:rPr>
+              <w:t>(컷 — 사흘 뒤 저녁. 저택 현관. 벨이 울린다. 빅토리아가 매무새를 고치고 문을 연다.)</w:t>
+            </w:r>
+          </w:p>
+          <w:p>
+            <w:r>
+              <w:rPr>
+                <w:rFonts w:ascii="Malgun Gothic" w:hAnsi="Malgun Gothic" w:eastAsia="Malgun Gothic"/>
+                <w:sz w:val="20"/>
+              </w:rPr>
+              <w:t>(문 앞 — 딸 슬론이 웃으며 옆 남자의 팔짱을 끼고 있다.)</w:t>
+            </w:r>
+          </w:p>
+          <w:p>
+            <w:r>
+              <w:rPr>
+                <w:rFonts w:ascii="Malgun Gothic" w:hAnsi="Malgun Gothic" w:eastAsia="Malgun Gothic"/>
+                <w:sz w:val="20"/>
+              </w:rPr>
+              <w:t>슬론 — "엄마, 이든이야."</w:t>
+            </w:r>
+          </w:p>
+          <w:p>
+            <w:r>
+              <w:rPr>
+                <w:rFonts w:ascii="Malgun Gothic" w:hAnsi="Malgun Gothic" w:eastAsia="Malgun Gothic"/>
+                <w:sz w:val="20"/>
+              </w:rPr>
+              <w:t>클리프행어: 카메라가 딸의 웃는 얼굴에서 옆으로 밀려 그 남자의 눈에 가 멎는다. 그 눈은 이미 빅토리아를 보고 있다.</w:t>
+            </w:r>
+          </w:p>
+          <w:p>
+            <w:r>
+              <w:rPr>
+                <w:rFonts w:ascii="Malgun Gothic" w:hAnsi="Malgun Gothic" w:eastAsia="Malgun Gothic"/>
+                <w:sz w:val="20"/>
+              </w:rPr>
+              <w:t>2화</w:t>
+            </w:r>
+          </w:p>
+          <w:p>
+            <w:r>
+              <w:rPr>
+                <w:rFonts w:ascii="Malgun Gothic" w:hAnsi="Malgun Gothic" w:eastAsia="Malgun Gothic"/>
+                <w:sz w:val="20"/>
+              </w:rPr>
+              <w:t>(그 밤으로 되돌아간다. 객실. 불은 안 켜져 있고 창밖 도시 불빛만 든다. 침대 위.)</w:t>
+            </w:r>
+          </w:p>
+          <w:p>
+            <w:r>
+              <w:rPr>
+                <w:rFonts w:ascii="Malgun Gothic" w:hAnsi="Malgun Gothic" w:eastAsia="Malgun Gothic"/>
+                <w:sz w:val="20"/>
+              </w:rPr>
+              <w:t>VO — 내 목에서 나는 소린데 처음 듣는 소리였다.</w:t>
+            </w:r>
+          </w:p>
+          <w:p>
+            <w:r>
+              <w:rPr>
+                <w:rFonts w:ascii="Malgun Gothic" w:hAnsi="Malgun Gothic" w:eastAsia="Malgun Gothic"/>
+                <w:sz w:val="20"/>
+              </w:rPr>
+              <w:t>VO — 소리를 내는 나를 그 애가 보고 있다는 게 더 그랬다.</w:t>
+            </w:r>
+          </w:p>
+          <w:p>
+            <w:r>
+              <w:rPr>
+                <w:rFonts w:ascii="Malgun Gothic" w:hAnsi="Malgun Gothic" w:eastAsia="Malgun Gothic"/>
+                <w:sz w:val="20"/>
+              </w:rPr>
+              <w:t>VO — 그만두라고 하면 그만둘 것 같았다. 그래서 아무 말도 안 했다.</w:t>
+            </w:r>
+          </w:p>
+          <w:p>
+            <w:r>
+              <w:rPr>
+                <w:rFonts w:ascii="Malgun Gothic" w:hAnsi="Malgun Gothic" w:eastAsia="Malgun Gothic"/>
+                <w:sz w:val="20"/>
+              </w:rPr>
+              <w:t>(그가 그녀를 돌려세워 한참 본다.)</w:t>
+            </w:r>
+          </w:p>
+          <w:p>
+            <w:r>
+              <w:rPr>
+                <w:rFonts w:ascii="Malgun Gothic" w:hAnsi="Malgun Gothic" w:eastAsia="Malgun Gothic"/>
+                <w:sz w:val="20"/>
+              </w:rPr>
+              <w:t>VO — 배에 힘이 들어갔다. 나도 모르게.</w:t>
+            </w:r>
+          </w:p>
+          <w:p>
+            <w:r>
+              <w:rPr>
+                <w:rFonts w:ascii="Malgun Gothic" w:hAnsi="Malgun Gothic" w:eastAsia="Malgun Gothic"/>
+                <w:sz w:val="20"/>
+              </w:rPr>
+              <w:t>VO — 스무 살짜리 몸이 아니라는 걸 이 방에서 나만 알고 있었다.</w:t>
+            </w:r>
+          </w:p>
+          <w:p>
+            <w:r>
+              <w:rPr>
+                <w:rFonts w:ascii="Malgun Gothic" w:hAnsi="Malgun Gothic" w:eastAsia="Malgun Gothic"/>
+                <w:sz w:val="20"/>
+              </w:rPr>
+              <w:t>VO — 알려 주고 싶지 않았다.</w:t>
+            </w:r>
+          </w:p>
+          <w:p>
+            <w:r>
+              <w:rPr>
+                <w:rFonts w:ascii="Malgun Gothic" w:hAnsi="Malgun Gothic" w:eastAsia="Malgun Gothic"/>
+                <w:sz w:val="20"/>
+              </w:rPr>
+              <w:t>이든 — "불 켤게요."</w:t>
+            </w:r>
+          </w:p>
+          <w:p>
+            <w:r>
+              <w:rPr>
+                <w:rFonts w:ascii="Malgun Gothic" w:hAnsi="Malgun Gothic" w:eastAsia="Malgun Gothic"/>
+                <w:sz w:val="20"/>
+              </w:rPr>
+              <w:t>빅토리아 — "안 돼."</w:t>
+            </w:r>
+          </w:p>
+          <w:p>
+            <w:r>
+              <w:rPr>
+                <w:rFonts w:ascii="Malgun Gothic" w:hAnsi="Malgun Gothic" w:eastAsia="Malgun Gothic"/>
+                <w:sz w:val="20"/>
+              </w:rPr>
+              <w:t>이든 — "보고 싶은데."</w:t>
+            </w:r>
+          </w:p>
+          <w:p>
+            <w:r>
+              <w:rPr>
+                <w:rFonts w:ascii="Malgun Gothic" w:hAnsi="Malgun Gothic" w:eastAsia="Malgun Gothic"/>
+                <w:sz w:val="20"/>
+              </w:rPr>
+              <w:t>VO — 안 된다고 했는데 목소리가 안 세게 나왔다.</w:t>
+            </w:r>
+          </w:p>
+          <w:p>
+            <w:r>
+              <w:rPr>
+                <w:rFonts w:ascii="Malgun Gothic" w:hAnsi="Malgun Gothic" w:eastAsia="Malgun Gothic"/>
+                <w:sz w:val="20"/>
+              </w:rPr>
+              <w:t>VO — 안 세게 나온 걸 그 애도 들었을 것이다.</w:t>
+            </w:r>
+          </w:p>
+          <w:p>
+            <w:r>
+              <w:rPr>
+                <w:rFonts w:ascii="Malgun Gothic" w:hAnsi="Malgun Gothic" w:eastAsia="Malgun Gothic"/>
+                <w:sz w:val="20"/>
+              </w:rPr>
+              <w:t>(그가 스탠드를 켠다. 그녀가 팔로 가리려다 만다.)</w:t>
+            </w:r>
+          </w:p>
+          <w:p>
+            <w:r>
+              <w:rPr>
+                <w:rFonts w:ascii="Malgun Gothic" w:hAnsi="Malgun Gothic" w:eastAsia="Malgun Gothic"/>
+                <w:sz w:val="20"/>
+              </w:rPr>
+              <w:t>VO — 손이 먼저 올라갔다. 가리려고.</w:t>
+            </w:r>
+          </w:p>
+          <w:p>
+            <w:r>
+              <w:rPr>
+                <w:rFonts w:ascii="Malgun Gothic" w:hAnsi="Malgun Gothic" w:eastAsia="Malgun Gothic"/>
+                <w:sz w:val="20"/>
+              </w:rPr>
+              <w:t>VO — 올라가다 멈췄다. 가리면 진 것 같았다.</w:t>
+            </w:r>
+          </w:p>
+          <w:p>
+            <w:r>
+              <w:rPr>
+                <w:rFonts w:ascii="Malgun Gothic" w:hAnsi="Malgun Gothic" w:eastAsia="Malgun Gothic"/>
+                <w:sz w:val="20"/>
+              </w:rPr>
+              <w:t>VO — 그리고 불빛 아래에서 그 애 눈이 어디로 가는지 나는 다 보고 있었다.</w:t>
+            </w:r>
+          </w:p>
+          <w:p>
+            <w:r>
+              <w:rPr>
+                <w:rFonts w:ascii="Malgun Gothic" w:hAnsi="Malgun Gothic" w:eastAsia="Malgun Gothic"/>
+                <w:sz w:val="20"/>
+              </w:rPr>
+              <w:t>클리프행어: 팔이 내려간 자리에서 화면이 멎는다. 그는 아직 아무 말도 안 했다.</w:t>
+            </w:r>
+          </w:p>
+          <w:p>
+            <w:r>
+              <w:rPr>
+                <w:rFonts w:ascii="Malgun Gothic" w:hAnsi="Malgun Gothic" w:eastAsia="Malgun Gothic"/>
+                <w:sz w:val="20"/>
+              </w:rPr>
+              <w:t>3화</w:t>
+            </w:r>
+          </w:p>
+          <w:p>
+            <w:r>
+              <w:rPr>
+                <w:rFonts w:ascii="Malgun Gothic" w:hAnsi="Malgun Gothic" w:eastAsia="Malgun Gothic"/>
+                <w:sz w:val="20"/>
+              </w:rPr>
+              <w:t>(침대. 그가 그녀를 눕힌다. 시간이 아주 느리게 간다. 입술이 목에서 쇄골로 내려간다.)</w:t>
+            </w:r>
+          </w:p>
+          <w:p>
+            <w:r>
+              <w:rPr>
+                <w:rFonts w:ascii="Malgun Gothic" w:hAnsi="Malgun Gothic" w:eastAsia="Malgun Gothic"/>
+                <w:sz w:val="20"/>
+              </w:rPr>
+              <w:t>VO — 스물여덟이 왜 안 서두르는지 나는 이해가 안 갔다.</w:t>
+            </w:r>
+          </w:p>
+          <w:p>
+            <w:r>
+              <w:rPr>
+                <w:rFonts w:ascii="Malgun Gothic" w:hAnsi="Malgun Gothic" w:eastAsia="Malgun Gothic"/>
+                <w:sz w:val="20"/>
+              </w:rPr>
+              <w:t>VO — 남편은 늘 급했다. 급한 게 당연한 건 줄 알았다.</w:t>
+            </w:r>
+          </w:p>
+          <w:p>
+            <w:r>
+              <w:rPr>
+                <w:rFonts w:ascii="Malgun Gothic" w:hAnsi="Malgun Gothic" w:eastAsia="Malgun Gothic"/>
+                <w:sz w:val="20"/>
+              </w:rPr>
+              <w:t>VO — 아래로 내려갈수록 숨을 참고 있었다. 참는 걸 알고 더 천천히 갔다.</w:t>
+            </w:r>
+          </w:p>
+          <w:p>
+            <w:r>
+              <w:rPr>
+                <w:rFonts w:ascii="Malgun Gothic" w:hAnsi="Malgun Gothic" w:eastAsia="Malgun Gothic"/>
+                <w:sz w:val="20"/>
+              </w:rPr>
+              <w:t>VO — 참지 말라고 말해 주면 좋겠는데 아무 말도 안 했다.</w:t>
+            </w:r>
+          </w:p>
+          <w:p>
+            <w:r>
+              <w:rPr>
+                <w:rFonts w:ascii="Malgun Gothic" w:hAnsi="Malgun Gothic" w:eastAsia="Malgun Gothic"/>
+                <w:sz w:val="20"/>
+              </w:rPr>
+              <w:t>(그의 손이 무릎 안쪽에 닿는다. 그녀의 다리가 한 번 조여졌다 풀린다.)</w:t>
+            </w:r>
+          </w:p>
+          <w:p>
+            <w:r>
+              <w:rPr>
+                <w:rFonts w:ascii="Malgun Gothic" w:hAnsi="Malgun Gothic" w:eastAsia="Malgun Gothic"/>
+                <w:sz w:val="20"/>
+              </w:rPr>
+              <w:t>VO — 무릎 안쪽에 손이 닿았을 때 다리가 저절로 조여졌다.</w:t>
+            </w:r>
+          </w:p>
+          <w:p>
+            <w:r>
+              <w:rPr>
+                <w:rFonts w:ascii="Malgun Gothic" w:hAnsi="Malgun Gothic" w:eastAsia="Malgun Gothic"/>
+                <w:sz w:val="20"/>
+              </w:rPr>
+              <w:t>VO — 조여진 걸 그 애가 알았다. 알고 거기서 멈췄다.</w:t>
+            </w:r>
+          </w:p>
+          <w:p>
+            <w:r>
+              <w:rPr>
+                <w:rFonts w:ascii="Malgun Gothic" w:hAnsi="Malgun Gothic" w:eastAsia="Malgun Gothic"/>
+                <w:sz w:val="20"/>
+              </w:rPr>
+              <w:t>VO — 멈추니까 내가 기다리게 됐다. 그게 이 남자가 하는 방식이었다.</w:t>
+            </w:r>
+          </w:p>
+          <w:p>
+            <w:r>
+              <w:rPr>
+                <w:rFonts w:ascii="Malgun Gothic" w:hAnsi="Malgun Gothic" w:eastAsia="Malgun Gothic"/>
+                <w:sz w:val="20"/>
+              </w:rPr>
+              <w:t>VO — 시트를 움켜쥐고 있었다. 언제부터인지 모르겠다.</w:t>
+            </w:r>
+          </w:p>
+          <w:p>
+            <w:r>
+              <w:rPr>
+                <w:rFonts w:ascii="Malgun Gothic" w:hAnsi="Malgun Gothic" w:eastAsia="Malgun Gothic"/>
+                <w:sz w:val="20"/>
+              </w:rPr>
+              <w:t>(그가 잠깐 멈추고 올려다본다.)</w:t>
+            </w:r>
+          </w:p>
+          <w:p>
+            <w:r>
+              <w:rPr>
+                <w:rFonts w:ascii="Malgun Gothic" w:hAnsi="Malgun Gothic" w:eastAsia="Malgun Gothic"/>
+                <w:sz w:val="20"/>
+              </w:rPr>
+              <w:t>이든 — "지금 무슨 생각 해요?"</w:t>
+            </w:r>
+          </w:p>
+          <w:p>
+            <w:r>
+              <w:rPr>
+                <w:rFonts w:ascii="Malgun Gothic" w:hAnsi="Malgun Gothic" w:eastAsia="Malgun Gothic"/>
+                <w:sz w:val="20"/>
+              </w:rPr>
+              <w:t>빅토리아 — "아무 생각 안 해."</w:t>
+            </w:r>
+          </w:p>
+          <w:p>
+            <w:r>
+              <w:rPr>
+                <w:rFonts w:ascii="Malgun Gothic" w:hAnsi="Malgun Gothic" w:eastAsia="Malgun Gothic"/>
+                <w:sz w:val="20"/>
+              </w:rPr>
+              <w:t>VO — 나는 이게 끝나면 어떻게 집에 가나, 그 생각을 하고 있었다.</w:t>
+            </w:r>
+          </w:p>
+          <w:p>
+            <w:r>
+              <w:rPr>
+                <w:rFonts w:ascii="Malgun Gothic" w:hAnsi="Malgun Gothic" w:eastAsia="Malgun Gothic"/>
+                <w:sz w:val="20"/>
+              </w:rPr>
+              <w:t>VO — 그리고 끝나지 않았으면 좋겠다는 생각도 같이 하고 있었다.</w:t>
+            </w:r>
+          </w:p>
+          <w:p>
+            <w:r>
+              <w:rPr>
+                <w:rFonts w:ascii="Malgun Gothic" w:hAnsi="Malgun Gothic" w:eastAsia="Malgun Gothic"/>
+                <w:sz w:val="20"/>
+              </w:rPr>
+              <w:t>클리프행어: 다시 내려가는 그의 입술, 젖혀지는 빅토리아의 목.</w:t>
+            </w:r>
+          </w:p>
+          <w:p>
+            <w:r>
+              <w:rPr>
+                <w:rFonts w:ascii="Malgun Gothic" w:hAnsi="Malgun Gothic" w:eastAsia="Malgun Gothic"/>
+                <w:sz w:val="20"/>
+              </w:rPr>
+              <w:t>4화</w:t>
+            </w:r>
+          </w:p>
+          <w:p>
+            <w:r>
+              <w:rPr>
+                <w:rFonts w:ascii="Malgun Gothic" w:hAnsi="Malgun Gothic" w:eastAsia="Malgun Gothic"/>
+                <w:sz w:val="20"/>
+              </w:rPr>
+              <w:t>(두 몸이 이어진다. 창밖 도시 불빛이 천장에 어른거린다.)</w:t>
+            </w:r>
+          </w:p>
+          <w:p>
+            <w:r>
+              <w:rPr>
+                <w:rFonts w:ascii="Malgun Gothic" w:hAnsi="Malgun Gothic" w:eastAsia="Malgun Gothic"/>
+                <w:sz w:val="20"/>
+              </w:rPr>
+              <w:t>VO — 이어지는 순간 나는 숨을 못 쉬었다.</w:t>
+            </w:r>
+          </w:p>
+          <w:p>
+            <w:r>
+              <w:rPr>
+                <w:rFonts w:ascii="Malgun Gothic" w:hAnsi="Malgun Gothic" w:eastAsia="Malgun Gothic"/>
+                <w:sz w:val="20"/>
+              </w:rPr>
+              <w:t>VO — 아팠던 게 아니라 오래 안 해서 그런 거였다.</w:t>
+            </w:r>
+          </w:p>
+          <w:p>
+            <w:r>
+              <w:rPr>
+                <w:rFonts w:ascii="Malgun Gothic" w:hAnsi="Malgun Gothic" w:eastAsia="Malgun Gothic"/>
+                <w:sz w:val="20"/>
+              </w:rPr>
+              <w:t>VO — 오래 안 했다는 걸 이 남자가 알까 봐 그게 무서웠다.</w:t>
+            </w:r>
+          </w:p>
+          <w:p>
+            <w:r>
+              <w:rPr>
+                <w:rFonts w:ascii="Malgun Gothic" w:hAnsi="Malgun Gothic" w:eastAsia="Malgun Gothic"/>
+                <w:sz w:val="20"/>
+              </w:rPr>
+              <w:t>VO — 이 남자는 내 딸보다 세 살 많았다.</w:t>
+            </w:r>
+          </w:p>
+          <w:p>
+            <w:r>
+              <w:rPr>
+                <w:rFonts w:ascii="Malgun Gothic" w:hAnsi="Malgun Gothic" w:eastAsia="Malgun Gothic"/>
+                <w:sz w:val="20"/>
+              </w:rPr>
+              <w:t>VO — 그 생각이 나를 멈추게 하지 않았다.</w:t>
+            </w:r>
+          </w:p>
+          <w:p>
+            <w:r>
+              <w:rPr>
+                <w:rFonts w:ascii="Malgun Gothic" w:hAnsi="Malgun Gothic" w:eastAsia="Malgun Gothic"/>
+                <w:sz w:val="20"/>
+              </w:rPr>
+              <w:t>VO — 더.</w:t>
+            </w:r>
+          </w:p>
+          <w:p>
+            <w:r>
+              <w:rPr>
+                <w:rFonts w:ascii="Malgun Gothic" w:hAnsi="Malgun Gothic" w:eastAsia="Malgun Gothic"/>
+                <w:sz w:val="20"/>
+              </w:rPr>
+              <w:t>VO — 조금 더.</w:t>
+            </w:r>
+          </w:p>
+          <w:p>
+            <w:r>
+              <w:rPr>
+                <w:rFonts w:ascii="Malgun Gothic" w:hAnsi="Malgun Gothic" w:eastAsia="Malgun Gothic"/>
+                <w:sz w:val="20"/>
+              </w:rPr>
+              <w:t>(그가 그녀의 얼굴을 붙든다.)</w:t>
+            </w:r>
+          </w:p>
+          <w:p>
+            <w:r>
+              <w:rPr>
+                <w:rFonts w:ascii="Malgun Gothic" w:hAnsi="Malgun Gothic" w:eastAsia="Malgun Gothic"/>
+                <w:sz w:val="20"/>
+              </w:rPr>
+              <w:t>이든 — "눈 감지 마요."</w:t>
+            </w:r>
+          </w:p>
+          <w:p>
+            <w:r>
+              <w:rPr>
+                <w:rFonts w:ascii="Malgun Gothic" w:hAnsi="Malgun Gothic" w:eastAsia="Malgun Gothic"/>
+                <w:sz w:val="20"/>
+              </w:rPr>
+              <w:t>VO — 눈을 감으면 남편 얼굴이 올까 봐 감은 거였다.</w:t>
+            </w:r>
+          </w:p>
+          <w:p>
+            <w:r>
+              <w:rPr>
+                <w:rFonts w:ascii="Malgun Gothic" w:hAnsi="Malgun Gothic" w:eastAsia="Malgun Gothic"/>
+                <w:sz w:val="20"/>
+              </w:rPr>
+              <w:t>VO — 떴더니 스물여덟이 나를 보고 있었다.</w:t>
+            </w:r>
+          </w:p>
+          <w:p>
+            <w:r>
+              <w:rPr>
+                <w:rFonts w:ascii="Malgun Gothic" w:hAnsi="Malgun Gothic" w:eastAsia="Malgun Gothic"/>
+                <w:sz w:val="20"/>
+              </w:rPr>
+              <w:t>VO — 눈을 뜨고 있으라는 게 그렇게 힘든 줄 몰랐다.</w:t>
+            </w:r>
+          </w:p>
+          <w:p>
+            <w:r>
+              <w:rPr>
+                <w:rFonts w:ascii="Malgun Gothic" w:hAnsi="Malgun Gothic" w:eastAsia="Malgun Gothic"/>
+                <w:sz w:val="20"/>
+              </w:rPr>
+              <w:t>클리프행어: 눈을 감으려는 순간 그가 얼굴을 붙든다. 화면이 그녀 눈에서 안 떨어진다.</w:t>
+            </w:r>
+          </w:p>
+          <w:p>
+            <w:r>
+              <w:rPr>
+                <w:rFonts w:ascii="Malgun Gothic" w:hAnsi="Malgun Gothic" w:eastAsia="Malgun Gothic"/>
+                <w:sz w:val="20"/>
+              </w:rPr>
+              <w:t>5화</w:t>
+            </w:r>
+          </w:p>
+          <w:p>
+            <w:r>
+              <w:rPr>
+                <w:rFonts w:ascii="Malgun Gothic" w:hAnsi="Malgun Gothic" w:eastAsia="Malgun Gothic"/>
+                <w:sz w:val="20"/>
+              </w:rPr>
+              <w:t>(무너지고 난 뒤. 헝클어진 침대. 그녀가 천장을 본다. 옷은 발치에 떨어져 있다.)</w:t>
+            </w:r>
+          </w:p>
+          <w:p>
+            <w:r>
+              <w:rPr>
+                <w:rFonts w:ascii="Malgun Gothic" w:hAnsi="Malgun Gothic" w:eastAsia="Malgun Gothic"/>
+                <w:sz w:val="20"/>
+              </w:rPr>
+              <w:t>VO — 끝나고 나서 십 분쯤 아무도 말을 안 했다.</w:t>
+            </w:r>
+          </w:p>
+          <w:p>
+            <w:r>
+              <w:rPr>
+                <w:rFonts w:ascii="Malgun Gothic" w:hAnsi="Malgun Gothic" w:eastAsia="Malgun Gothic"/>
+                <w:sz w:val="20"/>
+              </w:rPr>
+              <w:t>VO — 옷은 발치에 있었다. 손만 뻗으면 됐다.</w:t>
+            </w:r>
+          </w:p>
+          <w:p>
+            <w:r>
+              <w:rPr>
+                <w:rFonts w:ascii="Malgun Gothic" w:hAnsi="Malgun Gothic" w:eastAsia="Malgun Gothic"/>
+                <w:sz w:val="20"/>
+              </w:rPr>
+              <w:t>VO — 뻗으면 이걸로 끝나는 거였다. 그러려고 왔으니까.</w:t>
+            </w:r>
+          </w:p>
+          <w:p>
+            <w:r>
+              <w:rPr>
+                <w:rFonts w:ascii="Malgun Gothic" w:hAnsi="Malgun Gothic" w:eastAsia="Malgun Gothic"/>
+                <w:sz w:val="20"/>
+              </w:rPr>
+              <w:t>VO — 일어나려고 했다. 진짜로 한 번 일어나려고 했다.</w:t>
+            </w:r>
+          </w:p>
+          <w:p>
+            <w:r>
+              <w:rPr>
+                <w:rFonts w:ascii="Malgun Gothic" w:hAnsi="Malgun Gothic" w:eastAsia="Malgun Gothic"/>
+                <w:sz w:val="20"/>
+              </w:rPr>
+              <w:t>(그의 손이 다시 허리로 온다.)</w:t>
+            </w:r>
+          </w:p>
+          <w:p>
+            <w:r>
+              <w:rPr>
+                <w:rFonts w:ascii="Malgun Gothic" w:hAnsi="Malgun Gothic" w:eastAsia="Malgun Gothic"/>
+                <w:sz w:val="20"/>
+              </w:rPr>
+              <w:t>VO — 그 애 손이 다시 왔을 때 나는 안 밀었다.</w:t>
+            </w:r>
+          </w:p>
+          <w:p>
+            <w:r>
+              <w:rPr>
+                <w:rFonts w:ascii="Malgun Gothic" w:hAnsi="Malgun Gothic" w:eastAsia="Malgun Gothic"/>
+                <w:sz w:val="20"/>
+              </w:rPr>
+              <w:t>VO — 밀 이유를 만들어 보려고 했는데 하나도 안 떠올랐다.</w:t>
+            </w:r>
+          </w:p>
+          <w:p>
+            <w:r>
+              <w:rPr>
+                <w:rFonts w:ascii="Malgun Gothic" w:hAnsi="Malgun Gothic" w:eastAsia="Malgun Gothic"/>
+                <w:sz w:val="20"/>
+              </w:rPr>
+              <w:t>VO — 남편 얼굴을 떠올려 봤다. 그것도 안 됐다.</w:t>
+            </w:r>
+          </w:p>
+          <w:p>
+            <w:r>
+              <w:rPr>
+                <w:rFonts w:ascii="Malgun Gothic" w:hAnsi="Malgun Gothic" w:eastAsia="Malgun Gothic"/>
+                <w:sz w:val="20"/>
+              </w:rPr>
+              <w:t>VO — 두 번째는 내가 먼저 돌아누웠다.</w:t>
+            </w:r>
+          </w:p>
+          <w:p>
+            <w:r>
+              <w:rPr>
+                <w:rFonts w:ascii="Malgun Gothic" w:hAnsi="Malgun Gothic" w:eastAsia="Malgun Gothic"/>
+                <w:sz w:val="20"/>
+              </w:rPr>
+              <w:t>클리프행어: 나가려고 주워 든 원피스가 손에서 다시 떨어진다.</w:t>
+            </w:r>
+          </w:p>
+          <w:p>
+            <w:r>
+              <w:rPr>
+                <w:rFonts w:ascii="Malgun Gothic" w:hAnsi="Malgun Gothic" w:eastAsia="Malgun Gothic"/>
+                <w:sz w:val="20"/>
+              </w:rPr>
+              <w:t>6화</w:t>
+            </w:r>
+          </w:p>
+          <w:p>
+            <w:r>
+              <w:rPr>
+                <w:rFonts w:ascii="Malgun Gothic" w:hAnsi="Malgun Gothic" w:eastAsia="Malgun Gothic"/>
+                <w:sz w:val="20"/>
+              </w:rPr>
+              <w:t>(새벽. 그가 잠들어 있다. 빅토리아가 옷을 주워 입는다. 클러치에서 반지를 꺼내 다시 낀다.)</w:t>
+            </w:r>
+          </w:p>
+          <w:p>
+            <w:r>
+              <w:rPr>
+                <w:rFonts w:ascii="Malgun Gothic" w:hAnsi="Malgun Gothic" w:eastAsia="Malgun Gothic"/>
+                <w:sz w:val="20"/>
+              </w:rPr>
+              <w:t>VO — 손이 부어서 반지가 잘 안 들어갔다.</w:t>
+            </w:r>
+          </w:p>
+          <w:p>
+            <w:r>
+              <w:rPr>
+                <w:rFonts w:ascii="Malgun Gothic" w:hAnsi="Malgun Gothic" w:eastAsia="Malgun Gothic"/>
+                <w:sz w:val="20"/>
+              </w:rPr>
+              <w:t>VO — 억지로 밀어 넣는데 손가락이 아팠다.</w:t>
+            </w:r>
+          </w:p>
+          <w:p>
+            <w:r>
+              <w:rPr>
+                <w:rFonts w:ascii="Malgun Gothic" w:hAnsi="Malgun Gothic" w:eastAsia="Malgun Gothic"/>
+                <w:sz w:val="20"/>
+              </w:rPr>
+              <w:t>VO — 일 년 동안 한 번도 안 뺐던 반지였다.</w:t>
+            </w:r>
+          </w:p>
+          <w:p>
+            <w:r>
+              <w:rPr>
+                <w:rFonts w:ascii="Malgun Gothic" w:hAnsi="Malgun Gothic" w:eastAsia="Malgun Gothic"/>
+                <w:sz w:val="20"/>
+              </w:rPr>
+              <w:t>(문을 열기 직전, 침대 쪽을 한 번 돌아본다.)</w:t>
+            </w:r>
+          </w:p>
+          <w:p>
+            <w:r>
+              <w:rPr>
+                <w:rFonts w:ascii="Malgun Gothic" w:hAnsi="Malgun Gothic" w:eastAsia="Malgun Gothic"/>
+                <w:sz w:val="20"/>
+              </w:rPr>
+              <w:t>VO — 카드 키를 두고 갈까 잠깐 생각했다. 두고 가면 다시 못 오니까.</w:t>
+            </w:r>
+          </w:p>
+          <w:p>
+            <w:r>
+              <w:rPr>
+                <w:rFonts w:ascii="Malgun Gothic" w:hAnsi="Malgun Gothic" w:eastAsia="Malgun Gothic"/>
+                <w:sz w:val="20"/>
+              </w:rPr>
+              <w:t>VO — 두고 왔다. 그러려고 두고 온 건지 아닌지는 지금도 모르겠다.</w:t>
+            </w:r>
+          </w:p>
+          <w:p>
+            <w:r>
+              <w:rPr>
+                <w:rFonts w:ascii="Malgun Gothic" w:hAnsi="Malgun Gothic" w:eastAsia="Malgun Gothic"/>
+                <w:sz w:val="20"/>
+              </w:rPr>
+              <w:t>VO — 엘리베이터에서 립스틱을 다시 발랐다. 손이 떨려서 두 번 만에 됐다.</w:t>
+            </w:r>
+          </w:p>
+          <w:p>
+            <w:r>
+              <w:rPr>
+                <w:rFonts w:ascii="Malgun Gothic" w:hAnsi="Malgun Gothic" w:eastAsia="Malgun Gothic"/>
+                <w:sz w:val="20"/>
+              </w:rPr>
+              <w:t>VO — 그런데 몸이 가벼웠다. 계단을 내려가는데 다리가 안 무거웠다.</w:t>
+            </w:r>
+          </w:p>
+          <w:p>
+            <w:r>
+              <w:rPr>
+                <w:rFonts w:ascii="Malgun Gothic" w:hAnsi="Malgun Gothic" w:eastAsia="Malgun Gothic"/>
+                <w:sz w:val="20"/>
+              </w:rPr>
+              <w:t>클리프행어: 호텔 복도로 나서는 빅토리아, 문이 등 뒤에서 닫힌다.</w:t>
+            </w:r>
+          </w:p>
+          <w:p>
+            <w:r>
+              <w:rPr>
+                <w:rFonts w:ascii="Malgun Gothic" w:hAnsi="Malgun Gothic" w:eastAsia="Malgun Gothic"/>
+                <w:sz w:val="20"/>
+              </w:rPr>
+              <w:t>7화</w:t>
+            </w:r>
+          </w:p>
+          <w:p>
+            <w:r>
+              <w:rPr>
+                <w:rFonts w:ascii="Malgun Gothic" w:hAnsi="Malgun Gothic" w:eastAsia="Malgun Gothic"/>
+                <w:sz w:val="20"/>
+              </w:rPr>
+              <w:t>(사흘 뒤 저녁. 저택 현관. 문이 열려 있고, 딸 옆에 선 이든이 손을 내밀고 있다.)</w:t>
+            </w:r>
+          </w:p>
+          <w:p>
+            <w:r>
+              <w:rPr>
+                <w:rFonts w:ascii="Malgun Gothic" w:hAnsi="Malgun Gothic" w:eastAsia="Malgun Gothic"/>
+                <w:sz w:val="20"/>
+              </w:rPr>
+              <w:t>VO — 딸이 이 년 만에 처음으로 진짜 괜찮은 사람이라고 했다. 이름은 얼굴 보고 소개하겠다면서.</w:t>
+            </w:r>
+          </w:p>
+          <w:p>
+            <w:r>
+              <w:rPr>
+                <w:rFonts w:ascii="Malgun Gothic" w:hAnsi="Malgun Gothic" w:eastAsia="Malgun Gothic"/>
+                <w:sz w:val="20"/>
+              </w:rPr>
+              <w:t>VO — 나는 그날 아침에 미용실에 갔다.</w:t>
+            </w:r>
+          </w:p>
+          <w:p>
+            <w:r>
+              <w:rPr>
+                <w:rFonts w:ascii="Malgun Gothic" w:hAnsi="Malgun Gothic" w:eastAsia="Malgun Gothic"/>
+                <w:sz w:val="20"/>
+              </w:rPr>
+              <w:t>이든 — "처음 뵙겠습니다, 빅토리아."</w:t>
+            </w:r>
+          </w:p>
+          <w:p>
+            <w:r>
+              <w:rPr>
+                <w:rFonts w:ascii="Malgun Gothic" w:hAnsi="Malgun Gothic" w:eastAsia="Malgun Gothic"/>
+                <w:sz w:val="20"/>
+              </w:rPr>
+              <w:t>VO — 딸한테 내 진짜 이름을 듣고 온 것이다. 아주 정확하게 발음했다.</w:t>
+            </w:r>
+          </w:p>
+          <w:p>
+            <w:r>
+              <w:rPr>
+                <w:rFonts w:ascii="Malgun Gothic" w:hAnsi="Malgun Gothic" w:eastAsia="Malgun Gothic"/>
+                <w:sz w:val="20"/>
+              </w:rPr>
+              <w:t>VO — 목소리가 한 음절도 안 흔들렸다. 나는 그 손을 바로 못 잡았다.</w:t>
+            </w:r>
+          </w:p>
+          <w:p>
+            <w:r>
+              <w:rPr>
+                <w:rFonts w:ascii="Malgun Gothic" w:hAnsi="Malgun Gothic" w:eastAsia="Malgun Gothic"/>
+                <w:sz w:val="20"/>
+              </w:rPr>
+              <w:t>클리프행어: 내밀어진 손 위에서 화면이 멎는다. 옆에서 딸이 웃고 있다.</w:t>
+            </w:r>
+          </w:p>
+          <w:p>
+            <w:r>
+              <w:rPr>
+                <w:rFonts w:ascii="Malgun Gothic" w:hAnsi="Malgun Gothic" w:eastAsia="Malgun Gothic"/>
+                <w:sz w:val="20"/>
+              </w:rPr>
+              <w:t>8화</w:t>
+            </w:r>
+          </w:p>
+          <w:p>
+            <w:r>
+              <w:rPr>
+                <w:rFonts w:ascii="Malgun Gothic" w:hAnsi="Malgun Gothic" w:eastAsia="Malgun Gothic"/>
+                <w:sz w:val="20"/>
+              </w:rPr>
+              <w:t>(저녁 식탁. 셋. 슬론이 신나서 떠든다. 빅토리아는 물만 마신다.)</w:t>
+            </w:r>
+          </w:p>
+          <w:p>
+            <w:r>
+              <w:rPr>
+                <w:rFonts w:ascii="Malgun Gothic" w:hAnsi="Malgun Gothic" w:eastAsia="Malgun Gothic"/>
+                <w:sz w:val="20"/>
+              </w:rPr>
+              <w:t>VO — 물을 세 잔 마셨다. 목이 계속 말랐다.</w:t>
+            </w:r>
+          </w:p>
+          <w:p>
+            <w:r>
+              <w:rPr>
+                <w:rFonts w:ascii="Malgun Gothic" w:hAnsi="Malgun Gothic" w:eastAsia="Malgun Gothic"/>
+                <w:sz w:val="20"/>
+              </w:rPr>
+              <w:t>VO — 저 애가 내 잔에 물을 따라 주는데, 손등이 스쳤다.</w:t>
+            </w:r>
+          </w:p>
+          <w:p>
+            <w:r>
+              <w:rPr>
+                <w:rFonts w:ascii="Malgun Gothic" w:hAnsi="Malgun Gothic" w:eastAsia="Malgun Gothic"/>
+                <w:sz w:val="20"/>
+              </w:rPr>
+              <w:t>VO — 사흘 전에 그 손이 어디에 있었는지가 한꺼번에 왔다.</w:t>
+            </w:r>
+          </w:p>
+          <w:p>
+            <w:r>
+              <w:rPr>
+                <w:rFonts w:ascii="Malgun Gothic" w:hAnsi="Malgun Gothic" w:eastAsia="Malgun Gothic"/>
+                <w:sz w:val="20"/>
+              </w:rPr>
+              <w:t>(이든이 와인을 따르며 고개를 든다.)</w:t>
+            </w:r>
+          </w:p>
+          <w:p>
+            <w:r>
+              <w:rPr>
+                <w:rFonts w:ascii="Malgun Gothic" w:hAnsi="Malgun Gothic" w:eastAsia="Malgun Gothic"/>
+                <w:sz w:val="20"/>
+              </w:rPr>
+              <w:t>이든 — "빅토리아…?"</w:t>
+            </w:r>
+          </w:p>
+          <w:p>
+            <w:r>
+              <w:rPr>
+                <w:rFonts w:ascii="Malgun Gothic" w:hAnsi="Malgun Gothic" w:eastAsia="Malgun Gothic"/>
+                <w:sz w:val="20"/>
+              </w:rPr>
+              <w:t>(빅토리아의 손이 멎는다.)</w:t>
+            </w:r>
+          </w:p>
+          <w:p>
+            <w:r>
+              <w:rPr>
+                <w:rFonts w:ascii="Malgun Gothic" w:hAnsi="Malgun Gothic" w:eastAsia="Malgun Gothic"/>
+                <w:sz w:val="20"/>
+              </w:rPr>
+              <w:t>이든 — "아는 분이랑 닮으셔서요. 비비안이라고."</w:t>
+            </w:r>
+          </w:p>
+          <w:p>
+            <w:r>
+              <w:rPr>
+                <w:rFonts w:ascii="Malgun Gothic" w:hAnsi="Malgun Gothic" w:eastAsia="Malgun Gothic"/>
+                <w:sz w:val="20"/>
+              </w:rPr>
+              <w:t>이든 — "무척 아름다운 분인데, 빅토리아 씨하고 참 닮으셨어요."</w:t>
+            </w:r>
+          </w:p>
+          <w:p>
+            <w:r>
+              <w:rPr>
+                <w:rFonts w:ascii="Malgun Gothic" w:hAnsi="Malgun Gothic" w:eastAsia="Malgun Gothic"/>
+                <w:sz w:val="20"/>
+              </w:rPr>
+              <w:t>슬론 — "아름다운 분~?"</w:t>
+            </w:r>
+          </w:p>
+          <w:p>
+            <w:r>
+              <w:rPr>
+                <w:rFonts w:ascii="Malgun Gothic" w:hAnsi="Malgun Gothic" w:eastAsia="Malgun Gothic"/>
+                <w:sz w:val="20"/>
+              </w:rPr>
+              <w:t>이든 — "그냥 아는 분이야."</w:t>
+            </w:r>
+          </w:p>
+          <w:p>
+            <w:r>
+              <w:rPr>
+                <w:rFonts w:ascii="Malgun Gothic" w:hAnsi="Malgun Gothic" w:eastAsia="Malgun Gothic"/>
+                <w:sz w:val="20"/>
+              </w:rPr>
+              <w:t>(슬론이 웃으며 그의 팔을 친다. 빅토리아는 잔을 들었다가 그대로 내려놓는다. 잔은 비어 있다.)</w:t>
+            </w:r>
+          </w:p>
+          <w:p>
+            <w:r>
+              <w:rPr>
+                <w:rFonts w:ascii="Malgun Gothic" w:hAnsi="Malgun Gothic" w:eastAsia="Malgun Gothic"/>
+                <w:sz w:val="20"/>
+              </w:rPr>
+              <w:t>VO — 들었던 거다. 그날 밤에 내가 삼킨 첫 글자를.</w:t>
+            </w:r>
+          </w:p>
+          <w:p>
+            <w:r>
+              <w:rPr>
+                <w:rFonts w:ascii="Malgun Gothic" w:hAnsi="Malgun Gothic" w:eastAsia="Malgun Gothic"/>
+                <w:sz w:val="20"/>
+              </w:rPr>
+              <w:t>VO — 심장이 목까지 왔는데, 무서워서 온 게 아니었다.</w:t>
+            </w:r>
+          </w:p>
+          <w:p>
+            <w:r>
+              <w:rPr>
+                <w:rFonts w:ascii="Malgun Gothic" w:hAnsi="Malgun Gothic" w:eastAsia="Malgun Gothic"/>
+                <w:sz w:val="20"/>
+              </w:rPr>
+              <w:t>VO — 아름다운 분이라고 했다. 내 딸한테. 나를 앞에 앉혀 놓고.</w:t>
+            </w:r>
+          </w:p>
+          <w:p>
+            <w:r>
+              <w:rPr>
+                <w:rFonts w:ascii="Malgun Gothic" w:hAnsi="Malgun Gothic" w:eastAsia="Malgun Gothic"/>
+                <w:sz w:val="20"/>
+              </w:rPr>
+              <w:t>VO — 얼굴 달아오르는 걸 딸이 볼까 봐 잔을 들었다. 비어 있는 잔이었다.</w:t>
+            </w:r>
+          </w:p>
+          <w:p>
+            <w:r>
+              <w:rPr>
+                <w:rFonts w:ascii="Malgun Gothic" w:hAnsi="Malgun Gothic" w:eastAsia="Malgun Gothic"/>
+                <w:sz w:val="20"/>
+              </w:rPr>
+              <w:t>(슬론이 전화를 받으러 자리를 뜬다. 식탁에 둘만 남는다.)</w:t>
+            </w:r>
+          </w:p>
+          <w:p>
+            <w:r>
+              <w:rPr>
+                <w:rFonts w:ascii="Malgun Gothic" w:hAnsi="Malgun Gothic" w:eastAsia="Malgun Gothic"/>
+                <w:sz w:val="20"/>
+              </w:rPr>
+              <w:t>(이든이 몸을 기울인다. 목소리를 낮춘다.)</w:t>
+            </w:r>
+          </w:p>
+          <w:p>
+            <w:r>
+              <w:rPr>
+                <w:rFonts w:ascii="Malgun Gothic" w:hAnsi="Malgun Gothic" w:eastAsia="Malgun Gothic"/>
+                <w:sz w:val="20"/>
+              </w:rPr>
+              <w:t>이든 — "비비안이라고 하셨잖아요."</w:t>
+            </w:r>
+          </w:p>
+          <w:p>
+            <w:r>
+              <w:rPr>
+                <w:rFonts w:ascii="Malgun Gothic" w:hAnsi="Malgun Gothic" w:eastAsia="Malgun Gothic"/>
+                <w:sz w:val="20"/>
+              </w:rPr>
+              <w:t>이든 — "저는 제 이름 드렸는데."</w:t>
+            </w:r>
+          </w:p>
+          <w:p>
+            <w:r>
+              <w:rPr>
+                <w:rFonts w:ascii="Malgun Gothic" w:hAnsi="Malgun Gothic" w:eastAsia="Malgun Gothic"/>
+                <w:sz w:val="20"/>
+              </w:rPr>
+              <w:t>빅토리아 — "…다신 그 얘기 꺼내지 마."</w:t>
+            </w:r>
+          </w:p>
+          <w:p>
+            <w:r>
+              <w:rPr>
+                <w:rFonts w:ascii="Malgun Gothic" w:hAnsi="Malgun Gothic" w:eastAsia="Malgun Gothic"/>
+                <w:sz w:val="20"/>
+              </w:rPr>
+              <w:t>이든 — "저는 그럴 생각 없는데요."</w:t>
+            </w:r>
+          </w:p>
+          <w:p>
+            <w:r>
+              <w:rPr>
+                <w:rFonts w:ascii="Malgun Gothic" w:hAnsi="Malgun Gothic" w:eastAsia="Malgun Gothic"/>
+                <w:sz w:val="20"/>
+              </w:rPr>
+              <w:t>(슬론이 돌아와 앉는다. 이든이 아무렇지도 않게 자세를 고치고 슬론 쪽으로 몸을 돌린다.)</w:t>
+            </w:r>
+          </w:p>
+          <w:p>
+            <w:r>
+              <w:rPr>
+                <w:rFonts w:ascii="Malgun Gothic" w:hAnsi="Malgun Gothic" w:eastAsia="Malgun Gothic"/>
+                <w:sz w:val="20"/>
+              </w:rPr>
+              <w:t>이든 — "자기야, 우리 집 그만 보러 다니자."</w:t>
+            </w:r>
+          </w:p>
+          <w:p>
+            <w:r>
+              <w:rPr>
+                <w:rFonts w:ascii="Malgun Gothic" w:hAnsi="Malgun Gothic" w:eastAsia="Malgun Gothic"/>
+                <w:sz w:val="20"/>
+              </w:rPr>
+              <w:t>슬론 — "왜?"</w:t>
+            </w:r>
+          </w:p>
+          <w:p>
+            <w:r>
+              <w:rPr>
+                <w:rFonts w:ascii="Malgun Gothic" w:hAnsi="Malgun Gothic" w:eastAsia="Malgun Gothic"/>
+                <w:sz w:val="20"/>
+              </w:rPr>
+              <w:t>이든 — "어머니 혼자 계시잖아. 아직 일 년밖에 안 됐어."</w:t>
+            </w:r>
+          </w:p>
+          <w:p>
+            <w:r>
+              <w:rPr>
+                <w:rFonts w:ascii="Malgun Gothic" w:hAnsi="Malgun Gothic" w:eastAsia="Malgun Gothic"/>
+                <w:sz w:val="20"/>
+              </w:rPr>
+              <w:t>이든 — "일 년만 여기 있자. 월세 아끼면 계약금 되고."</w:t>
+            </w:r>
+          </w:p>
+          <w:p>
+            <w:r>
+              <w:rPr>
+                <w:rFonts w:ascii="Malgun Gothic" w:hAnsi="Malgun Gothic" w:eastAsia="Malgun Gothic"/>
+                <w:sz w:val="20"/>
+              </w:rPr>
+              <w:t>(슬론이 말을 못 한다. 그러다 눈이 붉어진다.)</w:t>
+            </w:r>
+          </w:p>
+          <w:p>
+            <w:r>
+              <w:rPr>
+                <w:rFonts w:ascii="Malgun Gothic" w:hAnsi="Malgun Gothic" w:eastAsia="Malgun Gothic"/>
+                <w:sz w:val="20"/>
+              </w:rPr>
+              <w:t>슬론 — "…너 진짜 괜찮아? 우리 엄마야."</w:t>
+            </w:r>
+          </w:p>
+          <w:p>
+            <w:r>
+              <w:rPr>
+                <w:rFonts w:ascii="Malgun Gothic" w:hAnsi="Malgun Gothic" w:eastAsia="Malgun Gothic"/>
+                <w:sz w:val="20"/>
+              </w:rPr>
+              <w:t>이든 — "괜찮아."</w:t>
+            </w:r>
+          </w:p>
+          <w:p>
+            <w:r>
+              <w:rPr>
+                <w:rFonts w:ascii="Malgun Gothic" w:hAnsi="Malgun Gothic" w:eastAsia="Malgun Gothic"/>
+                <w:sz w:val="20"/>
+              </w:rPr>
+              <w:t>VO — 내 앞에서 저 애가 우는 걸 몇 년 만에 봤다.</w:t>
+            </w:r>
+          </w:p>
+          <w:p>
+            <w:r>
+              <w:rPr>
+                <w:rFonts w:ascii="Malgun Gothic" w:hAnsi="Malgun Gothic" w:eastAsia="Malgun Gothic"/>
+                <w:sz w:val="20"/>
+              </w:rPr>
+              <w:t>VO — 엄마 혼자 두고 나가는 게 마음에 걸린다는 말을, 저 애는 몇 달째 삼키고 있었다.</w:t>
+            </w:r>
+          </w:p>
+          <w:p>
+            <w:r>
+              <w:rPr>
+                <w:rFonts w:ascii="Malgun Gothic" w:hAnsi="Malgun Gothic" w:eastAsia="Malgun Gothic"/>
+                <w:sz w:val="20"/>
+              </w:rPr>
+              <w:t>VO — 나한테는 끝내 못 했던 그 말을, 저 애 남자가 대신 꺼내 줬다.</w:t>
+            </w:r>
+          </w:p>
+          <w:p>
+            <w:r>
+              <w:rPr>
+                <w:rFonts w:ascii="Malgun Gothic" w:hAnsi="Malgun Gothic" w:eastAsia="Malgun Gothic"/>
+                <w:sz w:val="20"/>
+              </w:rPr>
+              <w:t>(딸이 이든의 목을 끌어안는다. 이든의 눈은 빅토리아에게 고정돼 있다. 그 시선이 그녀의 목선에서 한 박자 멎었다가 올라온다.)</w:t>
+            </w:r>
+          </w:p>
+          <w:p>
+            <w:r>
+              <w:rPr>
+                <w:rFonts w:ascii="Malgun Gothic" w:hAnsi="Malgun Gothic" w:eastAsia="Malgun Gothic"/>
+                <w:sz w:val="20"/>
+              </w:rPr>
+              <w:t>VO — 미안해하는 눈이 아니었다. 들켰을까 봐 살피는 눈도 아니었다.</w:t>
+            </w:r>
+          </w:p>
+          <w:p>
+            <w:r>
+              <w:rPr>
+                <w:rFonts w:ascii="Malgun Gothic" w:hAnsi="Malgun Gothic" w:eastAsia="Malgun Gothic"/>
+                <w:sz w:val="20"/>
+              </w:rPr>
+              <w:t>VO — 사흘 전에 나를 눕혀 놓고 위에서 내려다보던 그 눈이었다. 그걸 지금 내 딸 어깨 너머로 하고 있었다.</w:t>
+            </w:r>
+          </w:p>
+          <w:p>
+            <w:r>
+              <w:rPr>
+                <w:rFonts w:ascii="Malgun Gothic" w:hAnsi="Malgun Gothic" w:eastAsia="Malgun Gothic"/>
+                <w:sz w:val="20"/>
+              </w:rPr>
+              <w:t>VO — 거기가 어딘지 나는 알고 있었다. 그 애 입술이 제일 오래 있었던 자리였다.</w:t>
+            </w:r>
+          </w:p>
+          <w:p>
+            <w:r>
+              <w:rPr>
+                <w:rFonts w:ascii="Malgun Gothic" w:hAnsi="Malgun Gothic" w:eastAsia="Malgun Gothic"/>
+                <w:sz w:val="20"/>
+              </w:rPr>
+              <w:t>VO — 다리에 힘이 풀렸다. 딸이 우는 앞에서.</w:t>
+            </w:r>
+          </w:p>
+          <w:p>
+            <w:r>
+              <w:rPr>
+                <w:rFonts w:ascii="Malgun Gothic" w:hAnsi="Malgun Gothic" w:eastAsia="Malgun Gothic"/>
+                <w:sz w:val="20"/>
+              </w:rPr>
+              <w:t>VO — 나는 그 눈을 안 피했다. 그게 그날 내가 저지른 두 번째 짓이었다.</w:t>
+            </w:r>
+          </w:p>
+          <w:p>
+            <w:r>
+              <w:rPr>
+                <w:rFonts w:ascii="Malgun Gothic" w:hAnsi="Malgun Gothic" w:eastAsia="Malgun Gothic"/>
+                <w:sz w:val="20"/>
+              </w:rPr>
+              <w:t>클리프행어: 우는 딸의 뒤통수 너머로 카메라가 이든의 눈에 붙는다. 그 눈이 안 움직인다.</w:t>
+            </w:r>
           </w:p>
         </w:tc>
       </w:tr>

</xml_diff>

<commit_message>
Auto commit: 2026-08-02 04:00:02
</commit_message>
<xml_diff>
--- a/projects/14_my_daughters_husband/Vigloo AI Drama Proposal_MY DAUGHTER'S MAN.docx
+++ b/projects/14_my_daughters_husband/Vigloo AI Drama Proposal_MY DAUGHTER'S MAN.docx
@@ -1442,7 +1442,7 @@
                 <w:rFonts w:ascii="Malgun Gothic" w:hAnsi="Malgun Gothic" w:eastAsia="Malgun Gothic"/>
                 <w:sz w:val="20"/>
               </w:rPr>
-              <w:t>젊고, 잘생겼고, 몸이 좋다. 그리고 물러서지 않는다. 현관에서 얼어붙은 건 그녀 하나였고 그는 표정 하나 안 바꾸고 먼저 인사를 했다. 여자친구 앞에서는 흠잡을 데 없는 남자친구지만, 딸이 출근한 아침마다 그는 어머님을 벽으로 몬다. 손을 대는 일은 별로 없다 — 거리를 좁히고, 귀에 대고 말하고, 뺨을 잡아 얼굴을 돌리는 정도다. 그런데 그게 그녀를 더 못 움직이게 만든다. 그녀가 "없던 일"이라고 할 때마다 그는 사과하지 않고 그날 밤에 있었던 걸 하나씩 짚어 말한다. 나쁜 놈이다. 나쁜 놈인 걸 알면서도 뿌리쳐지지가 않는 게 이 남자의 정체다.</w:t>
+              <w:t>물러서는 법이 없다. 현관에서 얼어붙은 건 그녀 하나였고 그는 표정 하나 안 바꾸고 먼저 인사를 했다. 여자친구 앞에서는 흠잡을 데 없는 남자친구지만, 딸이 출근한 아침마다 그는 어머님을 벽으로 몬다. 손을 대는 일은 별로 없다 — 거리를 좁히고, 귀에 대고 말하고, 뺨을 잡아 얼굴을 돌리는 정도다. 그런데 그게 그녀를 더 못 움직이게 만든다. 그녀가 "없던 일"이라고 할 때마다 그는 사과하지 않고 그날 밤에 있었던 걸 하나씩 짚어 말한다. 나쁜 놈이다. 나쁜 놈인 걸 알면서도 뿌리쳐지지가 않는 게 이 남자의 정체다.</w:t>
             </w:r>
           </w:p>
         </w:tc>
@@ -1663,7 +1663,7 @@
                 <w:rFonts w:ascii="Malgun Gothic" w:hAnsi="Malgun Gothic" w:eastAsia="Malgun Gothic"/>
                 <w:sz w:val="20"/>
               </w:rPr>
-              <w:t>목까지 잠근 실크 블라우스, 올려 묶은 머리, 붉은 립스틱, 하이힐. 그렇게 다 잠가 놓아도 가슴에서 허리, 엉덩이로 떨어지는 선이 옷 위로 그대로 드러난다 — 가늘고 예쁜 딸과는 아예 종류가 다른, 육감적인 몸이다. 남편 일 주기 날 호텔 바에서 저지른 하룻밤은 그녀 인생에서 처음 있는 일이었고, 그날 이후 며칠 동안 그녀를 붙잡은 건 후회가 아니라 몸이 가벼웠다는 사실이었다. 그게 제일 부끄러웠다. 그 남자가 딸의 남자친구로 현관에 섰을 때부터 그녀의 하루는 밀어내는 일로 채워진다. 그런데 완전히는 못 밀어낸다 — 벽에 몰리면 손이 안 올라가고, 귀에 대고 말하면 다리에 힘이 빠지고, 뺨을 잡히면 고개가 돌아간다. 몇 번은 넘어갈 뻔하다 뿌리치고, 뿌리친 밤마다 더 못 잔다. 딸 앞에서는 한 음절도 안 흔들리는 사람이고, 그 애 앞에서만 무너진다.</w:t>
+              <w:t>목까지 잠근 실크 블라우스, 올려 묶은 머리, 붉은 립스틱, 하이힐. 그렇게 다 잠가 놓고 다닌다. 남편 일 주기 날 호텔 바에서 저지른 하룻밤은 그녀 인생에서 처음 있는 일이었고, 그날 이후 며칠 동안 그녀를 붙잡은 건 후회가 아니라 몸이 가벼웠다는 사실이었다. 그게 제일 부끄러웠다. 그 남자가 딸의 남자친구로 현관에 섰을 때부터 그녀의 하루는 밀어내는 일로 채워진다. 그런데 완전히는 못 밀어낸다 — 벽에 몰리면 손이 안 올라가고, 귀에 대고 말하면 다리에 힘이 빠지고, 뺨을 잡히면 고개가 돌아간다. 몇 번은 넘어갈 뻔하다 뿌리치고, 뿌리친 밤마다 더 못 잔다. 딸 앞에서는 한 음절도 안 흔들리는 사람이고, 그 애 앞에서만 무너진다.</w:t>
             </w:r>
           </w:p>
         </w:tc>
@@ -1947,7 +1947,7 @@
                 <w:rFonts w:ascii="Malgun Gothic" w:hAnsi="Malgun Gothic" w:eastAsia="Malgun Gothic"/>
                 <w:sz w:val="20"/>
               </w:rPr>
-              <w:t>가늘고 예쁜 슬렌더 미인이다. 빌런이 아니다 — 차갑고 일에 매인 사람일 뿐 남자친구에게도 엄마에게도 나쁘게 굴지 않는다. 이 집에서 벌어지는 일을 끝까지 알아내지 못한다. 엄마 목덜미의 자국을 무심코 보고, 남자친구에게서 엄마 향수를 맡고, 셋이 앉은 식탁에서 자기만 빼놓고 공기가 뜨거운 걸 느끼지만 묻지 못한다 — 입 밖에 내는 순간 자기가 이상한 사람이 되니까. 캐지도, 덫을 놓지도, 추궁하지도 않는다. 이름 붙이지 못한 그 느낌을 안고 해외 발령을 받아 떠나고, 떠나는 날 처음과 똑같은 말을 남긴다.</w:t>
+              <w:t>빌런이 아니다 — 차갑고 일에 매인 사람일 뿐 남자친구에게도 엄마에게도 나쁘게 굴지 않는다. 이 집에서 벌어지는 일을 끝까지 알아내지 못한다. 엄마 목덜미의 자국을 무심코 보고, 남자친구에게서 엄마 향수를 맡고, 셋이 앉은 식탁에서 자기만 빼놓고 공기가 뜨거운 걸 느끼지만 묻지 못한다 — 입 밖에 내는 순간 자기가 이상한 사람이 되니까. 캐지도, 덫을 놓지도, 추궁하지도 않는다. 이름 붙이지 못한 그 느낌을 안고 해외 발령을 받아 떠나고, 떠나는 날 처음과 똑같은 말을 남긴다.</w:t>
             </w:r>
           </w:p>
         </w:tc>
@@ -2338,7 +2338,7 @@
                 <w:rFonts w:ascii="Malgun Gothic" w:hAnsi="Malgun Gothic" w:eastAsia="Malgun Gothic"/>
                 <w:sz w:val="20"/>
               </w:rPr>
-              <w:t>정사 장면이 없는 회에도 화면은 달아 있다. 낮의 빅토리아는 목까지 잠근 실크와 올린 머리와 하이힐로 완벽하게 잠겨 있고, 밤의 빅토리아는 슬립 한 장이다. 카메라는 그 낙차를 아끼지 않고, 가늘고 예쁜 딸과 육감적인 엄마가 한 화면에 같이 잡히는 순간도 피하지 않는다.</w:t>
+              <w:t>정사 장면이 없는 회에도 화면은 달아 있다. 낮의 빅토리아는 목까지 잠근 실크와 올린 머리와 하이힐로 완벽하게 잠겨 있고, 밤의 빅토리아는 슬립 한 장이다. 카메라는 그 낙차를 아끼지 않고, 슬립 차림의 엄마와 딸이 한 화면에 같이 잡히는 순간도 피하지 않는다.</w:t>
             </w:r>
           </w:p>
         </w:tc>

</xml_diff>